<commit_message>
Power Electronics + UGR Screen
</commit_message>
<xml_diff>
--- a/Uni_Courses/Third_Year/Power Electronics 3/Borkovec 2941124B - Lab 3 Induction Motor.docx
+++ b/Uni_Courses/Third_Year/Power Electronics 3/Borkovec 2941124B - Lab 3 Induction Motor.docx
@@ -748,16 +748,56 @@
     <w:p/>
     <w:p/>
     <w:p/>
+    <w:p>
+      <w:r>
+        <w:rPr>
+          <w:noProof/>
+        </w:rPr>
+        <w:drawing>
+          <wp:inline distT="0" distB="0" distL="0" distR="0" wp14:anchorId="6261CB69" wp14:editId="0230F00E">
+            <wp:extent cx="6118225" cy="2139950"/>
+            <wp:effectExtent l="0" t="0" r="3175" b="6350"/>
+            <wp:docPr id="1153668255" name="Picture 1" descr="A close-up of a white background&#10;&#10;AI-generated content may be incorrect."/>
+            <wp:cNvGraphicFramePr>
+              <a:graphicFrameLocks xmlns:a="http://schemas.openxmlformats.org/drawingml/2006/main" noChangeAspect="1"/>
+            </wp:cNvGraphicFramePr>
+            <a:graphic xmlns:a="http://schemas.openxmlformats.org/drawingml/2006/main">
+              <a:graphicData uri="http://schemas.openxmlformats.org/drawingml/2006/picture">
+                <pic:pic xmlns:pic="http://schemas.openxmlformats.org/drawingml/2006/picture">
+                  <pic:nvPicPr>
+                    <pic:cNvPr id="1153668255" name="Picture 1" descr="A close-up of a white background&#10;&#10;AI-generated content may be incorrect."/>
+                    <pic:cNvPicPr/>
+                  </pic:nvPicPr>
+                  <pic:blipFill>
+                    <a:blip r:embed="rId7" cstate="print">
+                      <a:extLst>
+                        <a:ext uri="{28A0092B-C50C-407E-A947-70E740481C1C}">
+                          <a14:useLocalDpi xmlns:a14="http://schemas.microsoft.com/office/drawing/2010/main" val="0"/>
+                        </a:ext>
+                      </a:extLst>
+                    </a:blip>
+                    <a:stretch>
+                      <a:fillRect/>
+                    </a:stretch>
+                  </pic:blipFill>
+                  <pic:spPr>
+                    <a:xfrm>
+                      <a:off x="0" y="0"/>
+                      <a:ext cx="6118225" cy="2139950"/>
+                    </a:xfrm>
+                    <a:prstGeom prst="rect">
+                      <a:avLst/>
+                    </a:prstGeom>
+                  </pic:spPr>
+                </pic:pic>
+              </a:graphicData>
+            </a:graphic>
+          </wp:inline>
+        </w:drawing>
+      </w:r>
+    </w:p>
     <w:p/>
     <w:p/>
-    <w:p/>
-    <w:p/>
-    <w:p/>
-    <w:p/>
-    <w:p/>
-    <w:p/>
-    <w:p/>
-    <w:p/>
     <w:p>
       <w:pPr>
         <w:ind w:left="720" w:firstLine="720"/>
@@ -897,38 +937,83 @@
     </w:p>
     <w:p>
       <w:pPr>
-        <w:jc w:val="both"/>
-      </w:pPr>
-    </w:p>
-    <w:p>
-      <w:pPr>
-        <w:jc w:val="both"/>
-      </w:pPr>
-    </w:p>
-    <w:p>
-      <w:pPr>
-        <w:jc w:val="both"/>
-      </w:pPr>
-    </w:p>
-    <w:p>
-      <w:pPr>
-        <w:jc w:val="both"/>
-      </w:pPr>
-    </w:p>
-    <w:p>
-      <w:pPr>
-        <w:jc w:val="both"/>
-      </w:pPr>
-    </w:p>
-    <w:p>
-      <w:pPr>
-        <w:jc w:val="both"/>
-      </w:pPr>
-    </w:p>
-    <w:p>
-      <w:pPr>
-        <w:jc w:val="both"/>
-      </w:pPr>
+        <w:pStyle w:val="NormalWeb"/>
+        <w:rPr>
+          <w:rFonts w:ascii="Times" w:hAnsi="Times"/>
+          <w:color w:val="000000"/>
+          <w:sz w:val="27"/>
+          <w:szCs w:val="27"/>
+        </w:rPr>
+      </w:pPr>
+      <w:r>
+        <w:rPr>
+          <w:rFonts w:ascii="Times" w:hAnsi="Times"/>
+          <w:color w:val="000000"/>
+          <w:sz w:val="27"/>
+          <w:szCs w:val="27"/>
+        </w:rPr>
+        <w:t>Motor REF: FM9981</w:t>
+      </w:r>
+    </w:p>
+    <w:p>
+      <w:pPr>
+        <w:pStyle w:val="NormalWeb"/>
+        <w:rPr>
+          <w:rFonts w:ascii="Times" w:hAnsi="Times"/>
+          <w:color w:val="000000"/>
+          <w:sz w:val="27"/>
+          <w:szCs w:val="27"/>
+        </w:rPr>
+      </w:pPr>
+      <w:r>
+        <w:rPr>
+          <w:rFonts w:ascii="Times" w:hAnsi="Times"/>
+          <w:color w:val="000000"/>
+          <w:sz w:val="27"/>
+          <w:szCs w:val="27"/>
+        </w:rPr>
+        <w:t>Input: 41.5V 3PH 1.8A</w:t>
+      </w:r>
+    </w:p>
+    <w:p>
+      <w:pPr>
+        <w:pStyle w:val="NormalWeb"/>
+        <w:rPr>
+          <w:rFonts w:ascii="Times" w:hAnsi="Times"/>
+          <w:color w:val="000000"/>
+          <w:sz w:val="27"/>
+          <w:szCs w:val="27"/>
+        </w:rPr>
+      </w:pPr>
+      <w:r>
+        <w:rPr>
+          <w:rFonts w:ascii="Times" w:hAnsi="Times"/>
+          <w:color w:val="000000"/>
+          <w:sz w:val="27"/>
+          <w:szCs w:val="27"/>
+        </w:rPr>
+        <w:t>Output: 50W 1400rpm</w:t>
+      </w:r>
+    </w:p>
+    <w:p>
+      <w:pPr>
+        <w:pStyle w:val="NormalWeb"/>
+        <w:rPr>
+          <w:rFonts w:ascii="Times" w:hAnsi="Times"/>
+          <w:color w:val="000000"/>
+          <w:sz w:val="27"/>
+          <w:szCs w:val="27"/>
+        </w:rPr>
+      </w:pPr>
+      <w:r>
+        <w:rPr>
+          <w:rFonts w:ascii="Times" w:hAnsi="Times"/>
+          <w:color w:val="000000"/>
+          <w:sz w:val="27"/>
+          <w:szCs w:val="27"/>
+        </w:rPr>
+        <w:t>AUTO RESET PROTECTOR</w:t>
+      </w:r>
     </w:p>
     <w:p>
       <w:pPr>
@@ -2215,10 +2300,10 @@
             <v:path o:extrusionok="f" gradientshapeok="t" o:connecttype="rect"/>
             <o:lock v:ext="edit" aspectratio="t"/>
           </v:shapetype>
-          <v:shape id="_x0000_i1033" type="#_x0000_t75" alt="" style="width:90.4pt;height:37.25pt;mso-width-percent:0;mso-height-percent:0;mso-width-percent:0;mso-height-percent:0" o:ole="">
-            <v:imagedata r:id="rId7" o:title=""/>
+          <v:shape id="_x0000_i1033" type="#_x0000_t75" alt="" style="width:90.2pt;height:37.1pt;mso-width-percent:0;mso-height-percent:0;mso-width-percent:0;mso-height-percent:0" o:ole="">
+            <v:imagedata r:id="rId8" o:title=""/>
           </v:shape>
-          <o:OLEObject Type="Embed" ProgID="Equation.DSMT4" ShapeID="_x0000_i1033" DrawAspect="Content" ObjectID="_1833970087" r:id="rId8"/>
+          <o:OLEObject Type="Embed" ProgID="Equation.DSMT4" ShapeID="_x0000_i1033" DrawAspect="Content" ObjectID="_1835098896" r:id="rId9"/>
         </w:object>
       </w:r>
       <w:r>
@@ -2289,7 +2374,7 @@
                     </pic:cNvPicPr>
                   </pic:nvPicPr>
                   <pic:blipFill>
-                    <a:blip r:embed="rId9" cstate="print">
+                    <a:blip r:embed="rId10" cstate="print">
                       <a:extLst>
                         <a:ext uri="{28A0092B-C50C-407E-A947-70E740481C1C}">
                           <a14:useLocalDpi xmlns:a14="http://schemas.microsoft.com/office/drawing/2010/main" val="0"/>
@@ -2409,10 +2494,10 @@
                 <w:position w:val="-28"/>
               </w:rPr>
               <w:object w:dxaOrig="2799" w:dyaOrig="660" w14:anchorId="311B8485">
-                <v:shape id="_x0000_i1032" type="#_x0000_t75" alt="" style="width:102.25pt;height:32.3pt;mso-width-percent:0;mso-height-percent:0;mso-width-percent:0;mso-height-percent:0" o:ole="">
-                  <v:imagedata r:id="rId10" o:title=""/>
+                <v:shape id="_x0000_i1032" type="#_x0000_t75" alt="" style="width:102.55pt;height:32pt;mso-width-percent:0;mso-height-percent:0;mso-width-percent:0;mso-height-percent:0" o:ole="">
+                  <v:imagedata r:id="rId11" o:title=""/>
                 </v:shape>
-                <o:OLEObject Type="Embed" ProgID="Equation.DSMT4" ShapeID="_x0000_i1032" DrawAspect="Content" ObjectID="_1833970088" r:id="rId11"/>
+                <o:OLEObject Type="Embed" ProgID="Equation.DSMT4" ShapeID="_x0000_i1032" DrawAspect="Content" ObjectID="_1835098897" r:id="rId12"/>
               </w:object>
             </w:r>
           </w:p>
@@ -2533,7 +2618,7 @@
           <w:noProof/>
         </w:rPr>
         <w:drawing>
-          <wp:inline distT="0" distB="0" distL="0" distR="0" wp14:anchorId="2C8F552A" wp14:editId="234B075E">
+          <wp:inline distT="0" distB="0" distL="0" distR="0" wp14:anchorId="2C8F552A" wp14:editId="60CAAA61">
             <wp:extent cx="2857500" cy="1244600"/>
             <wp:effectExtent l="0" t="0" r="0" b="0"/>
             <wp:docPr id="4" name="Picture 4"/>
@@ -2550,7 +2635,7 @@
                     </pic:cNvPicPr>
                   </pic:nvPicPr>
                   <pic:blipFill>
-                    <a:blip r:embed="rId12" cstate="print">
+                    <a:blip r:embed="rId13" cstate="print">
                       <a:extLst>
                         <a:ext uri="{28A0092B-C50C-407E-A947-70E740481C1C}">
                           <a14:useLocalDpi xmlns:a14="http://schemas.microsoft.com/office/drawing/2010/main" val="0"/>
@@ -2640,7 +2725,7 @@
           <w:noProof/>
         </w:rPr>
         <w:drawing>
-          <wp:inline distT="0" distB="0" distL="0" distR="0" wp14:anchorId="0032B140" wp14:editId="48A5FF96">
+          <wp:inline distT="0" distB="0" distL="0" distR="0" wp14:anchorId="0032B140" wp14:editId="7B1B48F4">
             <wp:extent cx="1625600" cy="1358900"/>
             <wp:effectExtent l="0" t="0" r="0" b="0"/>
             <wp:docPr id="5" name="Picture 5"/>
@@ -2657,7 +2742,7 @@
                     </pic:cNvPicPr>
                   </pic:nvPicPr>
                   <pic:blipFill>
-                    <a:blip r:embed="rId13" cstate="print">
+                    <a:blip r:embed="rId14" cstate="print">
                       <a:extLst>
                         <a:ext uri="{28A0092B-C50C-407E-A947-70E740481C1C}">
                           <a14:useLocalDpi xmlns:a14="http://schemas.microsoft.com/office/drawing/2010/main" val="0"/>
@@ -2751,10 +2836,10 @@
           <w:position w:val="-30"/>
         </w:rPr>
         <w:object w:dxaOrig="5880" w:dyaOrig="820" w14:anchorId="66BA1518">
-          <v:shape id="_x0000_i1031" type="#_x0000_t75" alt="" style="width:295.35pt;height:40.9pt;mso-width-percent:0;mso-height-percent:0;mso-width-percent:0;mso-height-percent:0" o:ole="">
-            <v:imagedata r:id="rId14" o:title=""/>
+          <v:shape id="_x0000_i1031" type="#_x0000_t75" alt="" style="width:295.25pt;height:40.75pt;mso-width-percent:0;mso-height-percent:0;mso-width-percent:0;mso-height-percent:0" o:ole="">
+            <v:imagedata r:id="rId15" o:title=""/>
           </v:shape>
-          <o:OLEObject Type="Embed" ProgID="Equation.DSMT4" ShapeID="_x0000_i1031" DrawAspect="Content" ObjectID="_1833970089" r:id="rId15"/>
+          <o:OLEObject Type="Embed" ProgID="Equation.DSMT4" ShapeID="_x0000_i1031" DrawAspect="Content" ObjectID="_1835098898" r:id="rId16"/>
         </w:object>
       </w:r>
     </w:p>
@@ -2787,10 +2872,10 @@
           <w:position w:val="-30"/>
         </w:rPr>
         <w:object w:dxaOrig="3440" w:dyaOrig="820" w14:anchorId="16697DB3">
-          <v:shape id="_x0000_i1030" type="#_x0000_t75" alt="" style="width:171.8pt;height:40.9pt;mso-width-percent:0;mso-height-percent:0;mso-width-percent:0;mso-height-percent:0" o:ole="">
-            <v:imagedata r:id="rId16" o:title=""/>
+          <v:shape id="_x0000_i1030" type="#_x0000_t75" alt="" style="width:171.65pt;height:40.75pt;mso-width-percent:0;mso-height-percent:0;mso-width-percent:0;mso-height-percent:0" o:ole="">
+            <v:imagedata r:id="rId17" o:title=""/>
           </v:shape>
-          <o:OLEObject Type="Embed" ProgID="Equation.DSMT4" ShapeID="_x0000_i1030" DrawAspect="Content" ObjectID="_1833970090" r:id="rId17"/>
+          <o:OLEObject Type="Embed" ProgID="Equation.DSMT4" ShapeID="_x0000_i1030" DrawAspect="Content" ObjectID="_1835098899" r:id="rId18"/>
         </w:object>
       </w:r>
     </w:p>
@@ -4124,7 +4209,7 @@
           <w:noProof/>
         </w:rPr>
         <w:drawing>
-          <wp:inline distT="0" distB="0" distL="0" distR="0" wp14:anchorId="16CBF363" wp14:editId="50F10051">
+          <wp:inline distT="0" distB="0" distL="0" distR="0" wp14:anchorId="16CBF363" wp14:editId="3D582F4C">
             <wp:extent cx="1828800" cy="1244600"/>
             <wp:effectExtent l="0" t="0" r="0" b="0"/>
             <wp:docPr id="8" name="Picture 8"/>
@@ -4141,7 +4226,7 @@
                     </pic:cNvPicPr>
                   </pic:nvPicPr>
                   <pic:blipFill>
-                    <a:blip r:embed="rId18" cstate="print">
+                    <a:blip r:embed="rId19" cstate="print">
                       <a:extLst>
                         <a:ext uri="{28A0092B-C50C-407E-A947-70E740481C1C}">
                           <a14:useLocalDpi xmlns:a14="http://schemas.microsoft.com/office/drawing/2010/main" val="0"/>
@@ -4278,10 +4363,10 @@
           <w:position w:val="-14"/>
         </w:rPr>
         <w:object w:dxaOrig="4360" w:dyaOrig="440" w14:anchorId="51B51CEF">
-          <v:shape id="_x0000_i1029" type="#_x0000_t75" alt="" style="width:218.45pt;height:21.7pt;mso-width-percent:0;mso-height-percent:0;mso-width-percent:0;mso-height-percent:0" o:ole="">
-            <v:imagedata r:id="rId19" o:title=""/>
+          <v:shape id="_x0000_i1029" type="#_x0000_t75" alt="" style="width:218.2pt;height:21.8pt;mso-width-percent:0;mso-height-percent:0;mso-width-percent:0;mso-height-percent:0" o:ole="">
+            <v:imagedata r:id="rId20" o:title=""/>
           </v:shape>
-          <o:OLEObject Type="Embed" ProgID="Equation.DSMT4" ShapeID="_x0000_i1029" DrawAspect="Content" ObjectID="_1833970091" r:id="rId20"/>
+          <o:OLEObject Type="Embed" ProgID="Equation.DSMT4" ShapeID="_x0000_i1029" DrawAspect="Content" ObjectID="_1835098900" r:id="rId21"/>
         </w:object>
       </w:r>
     </w:p>
@@ -4306,10 +4391,10 @@
           <w:position w:val="-14"/>
         </w:rPr>
         <w:object w:dxaOrig="6880" w:dyaOrig="440" w14:anchorId="791C84D4">
-          <v:shape id="_x0000_i1028" type="#_x0000_t75" alt="" style="width:344.05pt;height:21.7pt;mso-width-percent:0;mso-height-percent:0;mso-width-percent:0;mso-height-percent:0" o:ole="">
-            <v:imagedata r:id="rId21" o:title=""/>
+          <v:shape id="_x0000_i1028" type="#_x0000_t75" alt="" style="width:344pt;height:21.8pt;mso-width-percent:0;mso-height-percent:0;mso-width-percent:0;mso-height-percent:0" o:ole="">
+            <v:imagedata r:id="rId22" o:title=""/>
           </v:shape>
-          <o:OLEObject Type="Embed" ProgID="Equation.DSMT4" ShapeID="_x0000_i1028" DrawAspect="Content" ObjectID="_1833970092" r:id="rId22"/>
+          <o:OLEObject Type="Embed" ProgID="Equation.DSMT4" ShapeID="_x0000_i1028" DrawAspect="Content" ObjectID="_1835098901" r:id="rId23"/>
         </w:object>
       </w:r>
     </w:p>
@@ -4665,25 +4750,7 @@
                 <w:sz w:val="28"/>
                 <w:szCs w:val="28"/>
               </w:rPr>
-              <w:t>1</w:t>
-            </w:r>
-            <w:r>
-              <w:rPr>
-                <w:b/>
-                <w:bCs/>
-                <w:sz w:val="28"/>
-                <w:szCs w:val="28"/>
-              </w:rPr>
-              <w:t>.</w:t>
-            </w:r>
-            <w:r>
-              <w:rPr>
-                <w:b/>
-                <w:bCs/>
-                <w:sz w:val="28"/>
-                <w:szCs w:val="28"/>
-              </w:rPr>
-              <w:t>78</w:t>
+              <w:t>1.78</w:t>
             </w:r>
           </w:p>
         </w:tc>
@@ -5050,9 +5117,9 @@
         <w:tblLook w:val="01E0" w:firstRow="1" w:lastRow="1" w:firstColumn="1" w:lastColumn="1" w:noHBand="0" w:noVBand="0"/>
       </w:tblPr>
       <w:tblGrid>
-        <w:gridCol w:w="858"/>
+        <w:gridCol w:w="859"/>
         <w:gridCol w:w="773"/>
-        <w:gridCol w:w="924"/>
+        <w:gridCol w:w="923"/>
         <w:gridCol w:w="865"/>
         <w:gridCol w:w="867"/>
         <w:gridCol w:w="1070"/>
@@ -5064,7 +5131,7 @@
       <w:tr>
         <w:tc>
           <w:tcPr>
-            <w:tcW w:w="984" w:type="dxa"/>
+            <w:tcW w:w="859" w:type="dxa"/>
           </w:tcPr>
           <w:p>
             <w:pPr>
@@ -5114,7 +5181,7 @@
         </w:tc>
         <w:tc>
           <w:tcPr>
-            <w:tcW w:w="898" w:type="dxa"/>
+            <w:tcW w:w="773" w:type="dxa"/>
           </w:tcPr>
           <w:p>
             <w:pPr>
@@ -5172,7 +5239,7 @@
         </w:tc>
         <w:tc>
           <w:tcPr>
-            <w:tcW w:w="1050" w:type="dxa"/>
+            <w:tcW w:w="923" w:type="dxa"/>
           </w:tcPr>
           <w:p>
             <w:pPr>
@@ -5205,7 +5272,7 @@
         </w:tc>
         <w:tc>
           <w:tcPr>
-            <w:tcW w:w="900" w:type="dxa"/>
+            <w:tcW w:w="865" w:type="dxa"/>
           </w:tcPr>
           <w:p>
             <w:pPr>
@@ -5249,7 +5316,7 @@
         </w:tc>
         <w:tc>
           <w:tcPr>
-            <w:tcW w:w="925" w:type="dxa"/>
+            <w:tcW w:w="867" w:type="dxa"/>
           </w:tcPr>
           <w:p>
             <w:pPr>
@@ -5271,7 +5338,7 @@
         </w:tc>
         <w:tc>
           <w:tcPr>
-            <w:tcW w:w="962" w:type="dxa"/>
+            <w:tcW w:w="1070" w:type="dxa"/>
           </w:tcPr>
           <w:p>
             <w:pPr>
@@ -5304,7 +5371,7 @@
         </w:tc>
         <w:tc>
           <w:tcPr>
-            <w:tcW w:w="1150" w:type="dxa"/>
+            <w:tcW w:w="1083" w:type="dxa"/>
           </w:tcPr>
           <w:p>
             <w:pPr>
@@ -5337,7 +5404,7 @@
         </w:tc>
         <w:tc>
           <w:tcPr>
-            <w:tcW w:w="1043" w:type="dxa"/>
+            <w:tcW w:w="1056" w:type="dxa"/>
           </w:tcPr>
           <w:p>
             <w:pPr>
@@ -5375,7 +5442,7 @@
         </w:tc>
         <w:tc>
           <w:tcPr>
-            <w:tcW w:w="1056" w:type="dxa"/>
+            <w:tcW w:w="913" w:type="dxa"/>
           </w:tcPr>
           <w:p>
             <w:pPr>
@@ -5431,7 +5498,7 @@
       <w:tr>
         <w:tc>
           <w:tcPr>
-            <w:tcW w:w="984" w:type="dxa"/>
+            <w:tcW w:w="859" w:type="dxa"/>
           </w:tcPr>
           <w:p>
             <w:pPr>
@@ -5448,11 +5515,14 @@
               </w:tabs>
               <w:jc w:val="both"/>
             </w:pPr>
-          </w:p>
-        </w:tc>
-        <w:tc>
-          <w:tcPr>
-            <w:tcW w:w="898" w:type="dxa"/>
+            <w:r>
+              <w:t>41.7</w:t>
+            </w:r>
+          </w:p>
+        </w:tc>
+        <w:tc>
+          <w:tcPr>
+            <w:tcW w:w="773" w:type="dxa"/>
           </w:tcPr>
           <w:p>
             <w:pPr>
@@ -5461,11 +5531,14 @@
               </w:tabs>
               <w:jc w:val="both"/>
             </w:pPr>
-          </w:p>
-        </w:tc>
-        <w:tc>
-          <w:tcPr>
-            <w:tcW w:w="1050" w:type="dxa"/>
+            <w:r>
+              <w:t>1.5</w:t>
+            </w:r>
+          </w:p>
+        </w:tc>
+        <w:tc>
+          <w:tcPr>
+            <w:tcW w:w="923" w:type="dxa"/>
           </w:tcPr>
           <w:p>
             <w:pPr>
@@ -5474,11 +5547,14 @@
               </w:tabs>
               <w:jc w:val="both"/>
             </w:pPr>
-          </w:p>
-        </w:tc>
-        <w:tc>
-          <w:tcPr>
-            <w:tcW w:w="900" w:type="dxa"/>
+            <w:r>
+              <w:t>69.9</w:t>
+            </w:r>
+          </w:p>
+        </w:tc>
+        <w:tc>
+          <w:tcPr>
+            <w:tcW w:w="865" w:type="dxa"/>
           </w:tcPr>
           <w:p>
             <w:pPr>
@@ -5487,11 +5563,14 @@
               </w:tabs>
               <w:jc w:val="both"/>
             </w:pPr>
-          </w:p>
-        </w:tc>
-        <w:tc>
-          <w:tcPr>
-            <w:tcW w:w="925" w:type="dxa"/>
+            <w:r>
+              <w:t>114</w:t>
+            </w:r>
+          </w:p>
+        </w:tc>
+        <w:tc>
+          <w:tcPr>
+            <w:tcW w:w="867" w:type="dxa"/>
           </w:tcPr>
           <w:p>
             <w:pPr>
@@ -5500,11 +5579,14 @@
               </w:tabs>
               <w:jc w:val="both"/>
             </w:pPr>
-          </w:p>
-        </w:tc>
-        <w:tc>
-          <w:tcPr>
-            <w:tcW w:w="962" w:type="dxa"/>
+            <w:r>
+              <w:t>0.52</w:t>
+            </w:r>
+          </w:p>
+        </w:tc>
+        <w:tc>
+          <w:tcPr>
+            <w:tcW w:w="1070" w:type="dxa"/>
           </w:tcPr>
           <w:p>
             <w:pPr>
@@ -5513,11 +5595,14 @@
               </w:tabs>
               <w:jc w:val="both"/>
             </w:pPr>
-          </w:p>
-        </w:tc>
-        <w:tc>
-          <w:tcPr>
-            <w:tcW w:w="1150" w:type="dxa"/>
+            <w:r>
+              <w:t>0.26</w:t>
+            </w:r>
+          </w:p>
+        </w:tc>
+        <w:tc>
+          <w:tcPr>
+            <w:tcW w:w="1083" w:type="dxa"/>
           </w:tcPr>
           <w:p>
             <w:pPr>
@@ -5526,11 +5611,14 @@
               </w:tabs>
               <w:jc w:val="both"/>
             </w:pPr>
-          </w:p>
-        </w:tc>
-        <w:tc>
-          <w:tcPr>
-            <w:tcW w:w="1043" w:type="dxa"/>
+            <w:r>
+              <w:t>1456</w:t>
+            </w:r>
+          </w:p>
+        </w:tc>
+        <w:tc>
+          <w:tcPr>
+            <w:tcW w:w="1056" w:type="dxa"/>
           </w:tcPr>
           <w:p>
             <w:pPr>
@@ -5539,11 +5627,14 @@
               </w:tabs>
               <w:jc w:val="both"/>
             </w:pPr>
-          </w:p>
-        </w:tc>
-        <w:tc>
-          <w:tcPr>
-            <w:tcW w:w="1056" w:type="dxa"/>
+            <w:r>
+              <w:t>152.5</w:t>
+            </w:r>
+          </w:p>
+        </w:tc>
+        <w:tc>
+          <w:tcPr>
+            <w:tcW w:w="913" w:type="dxa"/>
           </w:tcPr>
           <w:p>
             <w:pPr>
@@ -5552,6 +5643,9 @@
               </w:tabs>
               <w:jc w:val="both"/>
             </w:pPr>
+            <w:r>
+              <w:t>39.65</w:t>
+            </w:r>
           </w:p>
         </w:tc>
         <w:tc>
@@ -5565,13 +5659,16 @@
               </w:tabs>
               <w:jc w:val="both"/>
             </w:pPr>
+            <w:r>
+              <w:t>56.7</w:t>
+            </w:r>
           </w:p>
         </w:tc>
       </w:tr>
       <w:tr>
         <w:tc>
           <w:tcPr>
-            <w:tcW w:w="984" w:type="dxa"/>
+            <w:tcW w:w="859" w:type="dxa"/>
           </w:tcPr>
           <w:p>
             <w:pPr>
@@ -5580,11 +5677,14 @@
               </w:tabs>
               <w:jc w:val="both"/>
             </w:pPr>
-          </w:p>
-        </w:tc>
-        <w:tc>
-          <w:tcPr>
-            <w:tcW w:w="898" w:type="dxa"/>
+            <w:r>
+              <w:t>43.1</w:t>
+            </w:r>
+          </w:p>
+        </w:tc>
+        <w:tc>
+          <w:tcPr>
+            <w:tcW w:w="773" w:type="dxa"/>
           </w:tcPr>
           <w:p>
             <w:pPr>
@@ -5593,11 +5693,14 @@
               </w:tabs>
               <w:jc w:val="both"/>
             </w:pPr>
-          </w:p>
-        </w:tc>
-        <w:tc>
-          <w:tcPr>
-            <w:tcW w:w="1050" w:type="dxa"/>
+            <w:r>
+              <w:t>2.23</w:t>
+            </w:r>
+          </w:p>
+        </w:tc>
+        <w:tc>
+          <w:tcPr>
+            <w:tcW w:w="923" w:type="dxa"/>
           </w:tcPr>
           <w:p>
             <w:pPr>
@@ -5606,11 +5709,14 @@
               </w:tabs>
               <w:jc w:val="both"/>
             </w:pPr>
-          </w:p>
-        </w:tc>
-        <w:tc>
-          <w:tcPr>
-            <w:tcW w:w="900" w:type="dxa"/>
+            <w:r>
+              <w:t>113</w:t>
+            </w:r>
+          </w:p>
+        </w:tc>
+        <w:tc>
+          <w:tcPr>
+            <w:tcW w:w="865" w:type="dxa"/>
           </w:tcPr>
           <w:p>
             <w:pPr>
@@ -5619,6 +5725,9 @@
               </w:tabs>
               <w:jc w:val="both"/>
             </w:pPr>
+            <w:r>
+              <w:t>122</w:t>
+            </w:r>
           </w:p>
           <w:p>
             <w:pPr>
@@ -5631,7 +5740,7 @@
         </w:tc>
         <w:tc>
           <w:tcPr>
-            <w:tcW w:w="925" w:type="dxa"/>
+            <w:tcW w:w="867" w:type="dxa"/>
           </w:tcPr>
           <w:p>
             <w:pPr>
@@ -5640,11 +5749,14 @@
               </w:tabs>
               <w:jc w:val="both"/>
             </w:pPr>
-          </w:p>
-        </w:tc>
-        <w:tc>
-          <w:tcPr>
-            <w:tcW w:w="962" w:type="dxa"/>
+            <w:r>
+              <w:t>0.68</w:t>
+            </w:r>
+          </w:p>
+        </w:tc>
+        <w:tc>
+          <w:tcPr>
+            <w:tcW w:w="1070" w:type="dxa"/>
           </w:tcPr>
           <w:p>
             <w:pPr>
@@ -5653,11 +5765,14 @@
               </w:tabs>
               <w:jc w:val="both"/>
             </w:pPr>
-          </w:p>
-        </w:tc>
-        <w:tc>
-          <w:tcPr>
-            <w:tcW w:w="1150" w:type="dxa"/>
+            <w:r>
+              <w:t>0.74</w:t>
+            </w:r>
+          </w:p>
+        </w:tc>
+        <w:tc>
+          <w:tcPr>
+            <w:tcW w:w="1083" w:type="dxa"/>
           </w:tcPr>
           <w:p>
             <w:pPr>
@@ -5666,11 +5781,14 @@
               </w:tabs>
               <w:jc w:val="both"/>
             </w:pPr>
-          </w:p>
-        </w:tc>
-        <w:tc>
-          <w:tcPr>
-            <w:tcW w:w="1043" w:type="dxa"/>
+            <w:r>
+              <w:t>1405</w:t>
+            </w:r>
+          </w:p>
+        </w:tc>
+        <w:tc>
+          <w:tcPr>
+            <w:tcW w:w="1056" w:type="dxa"/>
           </w:tcPr>
           <w:p>
             <w:pPr>
@@ -5679,11 +5797,14 @@
               </w:tabs>
               <w:jc w:val="both"/>
             </w:pPr>
-          </w:p>
-        </w:tc>
-        <w:tc>
-          <w:tcPr>
-            <w:tcW w:w="1056" w:type="dxa"/>
+            <w:r>
+              <w:t>147.1</w:t>
+            </w:r>
+          </w:p>
+        </w:tc>
+        <w:tc>
+          <w:tcPr>
+            <w:tcW w:w="913" w:type="dxa"/>
           </w:tcPr>
           <w:p>
             <w:pPr>
@@ -5692,6 +5813,9 @@
               </w:tabs>
               <w:jc w:val="both"/>
             </w:pPr>
+            <w:r>
+              <w:t>108.9</w:t>
+            </w:r>
           </w:p>
         </w:tc>
         <w:tc>
@@ -5705,13 +5829,16 @@
               </w:tabs>
               <w:jc w:val="both"/>
             </w:pPr>
+            <w:r>
+              <w:t>96.4</w:t>
+            </w:r>
           </w:p>
         </w:tc>
       </w:tr>
       <w:tr>
         <w:tc>
           <w:tcPr>
-            <w:tcW w:w="984" w:type="dxa"/>
+            <w:tcW w:w="859" w:type="dxa"/>
           </w:tcPr>
           <w:p>
             <w:pPr>
@@ -5720,7 +5847,15 @@
               </w:tabs>
               <w:jc w:val="both"/>
             </w:pPr>
-          </w:p>
+            <w:r>
+              <w:t>41.4</w:t>
+            </w:r>
+          </w:p>
+        </w:tc>
+        <w:tc>
+          <w:tcPr>
+            <w:tcW w:w="773" w:type="dxa"/>
+          </w:tcPr>
           <w:p>
             <w:pPr>
               <w:tabs>
@@ -5728,11 +5863,14 @@
               </w:tabs>
               <w:jc w:val="both"/>
             </w:pPr>
-          </w:p>
-        </w:tc>
-        <w:tc>
-          <w:tcPr>
-            <w:tcW w:w="898" w:type="dxa"/>
+            <w:r>
+              <w:t>3.35</w:t>
+            </w:r>
+          </w:p>
+        </w:tc>
+        <w:tc>
+          <w:tcPr>
+            <w:tcW w:w="923" w:type="dxa"/>
           </w:tcPr>
           <w:p>
             <w:pPr>
@@ -5741,11 +5879,14 @@
               </w:tabs>
               <w:jc w:val="both"/>
             </w:pPr>
-          </w:p>
-        </w:tc>
-        <w:tc>
-          <w:tcPr>
-            <w:tcW w:w="1050" w:type="dxa"/>
+            <w:r>
+              <w:t>205</w:t>
+            </w:r>
+          </w:p>
+        </w:tc>
+        <w:tc>
+          <w:tcPr>
+            <w:tcW w:w="865" w:type="dxa"/>
           </w:tcPr>
           <w:p>
             <w:pPr>
@@ -5754,11 +5895,14 @@
               </w:tabs>
               <w:jc w:val="both"/>
             </w:pPr>
-          </w:p>
-        </w:tc>
-        <w:tc>
-          <w:tcPr>
-            <w:tcW w:w="900" w:type="dxa"/>
+            <w:r>
+              <w:t>127</w:t>
+            </w:r>
+          </w:p>
+        </w:tc>
+        <w:tc>
+          <w:tcPr>
+            <w:tcW w:w="867" w:type="dxa"/>
           </w:tcPr>
           <w:p>
             <w:pPr>
@@ -5767,11 +5911,14 @@
               </w:tabs>
               <w:jc w:val="both"/>
             </w:pPr>
-          </w:p>
-        </w:tc>
-        <w:tc>
-          <w:tcPr>
-            <w:tcW w:w="925" w:type="dxa"/>
+            <w:r>
+              <w:t>0.85</w:t>
+            </w:r>
+          </w:p>
+        </w:tc>
+        <w:tc>
+          <w:tcPr>
+            <w:tcW w:w="1070" w:type="dxa"/>
           </w:tcPr>
           <w:p>
             <w:pPr>
@@ -5780,11 +5927,14 @@
               </w:tabs>
               <w:jc w:val="both"/>
             </w:pPr>
-          </w:p>
-        </w:tc>
-        <w:tc>
-          <w:tcPr>
-            <w:tcW w:w="962" w:type="dxa"/>
+            <w:r>
+              <w:t>1.0</w:t>
+            </w:r>
+          </w:p>
+        </w:tc>
+        <w:tc>
+          <w:tcPr>
+            <w:tcW w:w="1083" w:type="dxa"/>
           </w:tcPr>
           <w:p>
             <w:pPr>
@@ -5793,11 +5943,14 @@
               </w:tabs>
               <w:jc w:val="both"/>
             </w:pPr>
-          </w:p>
-        </w:tc>
-        <w:tc>
-          <w:tcPr>
-            <w:tcW w:w="1150" w:type="dxa"/>
+            <w:r>
+              <w:t>1278</w:t>
+            </w:r>
+          </w:p>
+        </w:tc>
+        <w:tc>
+          <w:tcPr>
+            <w:tcW w:w="1056" w:type="dxa"/>
           </w:tcPr>
           <w:p>
             <w:pPr>
@@ -5806,11 +5959,14 @@
               </w:tabs>
               <w:jc w:val="both"/>
             </w:pPr>
-          </w:p>
-        </w:tc>
-        <w:tc>
-          <w:tcPr>
-            <w:tcW w:w="1043" w:type="dxa"/>
+            <w:r>
+              <w:t>133.8</w:t>
+            </w:r>
+          </w:p>
+        </w:tc>
+        <w:tc>
+          <w:tcPr>
+            <w:tcW w:w="913" w:type="dxa"/>
           </w:tcPr>
           <w:p>
             <w:pPr>
@@ -5819,11 +5975,14 @@
               </w:tabs>
               <w:jc w:val="both"/>
             </w:pPr>
-          </w:p>
-        </w:tc>
-        <w:tc>
-          <w:tcPr>
-            <w:tcW w:w="1056" w:type="dxa"/>
+            <w:r>
+              <w:t>133.8</w:t>
+            </w:r>
+          </w:p>
+        </w:tc>
+        <w:tc>
+          <w:tcPr>
+            <w:tcW w:w="1216" w:type="dxa"/>
           </w:tcPr>
           <w:p>
             <w:pPr>
@@ -5832,11 +5991,16 @@
               </w:tabs>
               <w:jc w:val="both"/>
             </w:pPr>
-          </w:p>
-        </w:tc>
-        <w:tc>
-          <w:tcPr>
-            <w:tcW w:w="1216" w:type="dxa"/>
+            <w:r>
+              <w:t>65.3</w:t>
+            </w:r>
+          </w:p>
+        </w:tc>
+      </w:tr>
+      <w:tr>
+        <w:tc>
+          <w:tcPr>
+            <w:tcW w:w="859" w:type="dxa"/>
           </w:tcPr>
           <w:p>
             <w:pPr>
@@ -5845,14 +6009,10 @@
               </w:tabs>
               <w:jc w:val="both"/>
             </w:pPr>
-          </w:p>
-        </w:tc>
-      </w:tr>
-      <w:tr>
-        <w:tc>
-          <w:tcPr>
-            <w:tcW w:w="984" w:type="dxa"/>
-          </w:tcPr>
+            <w:r>
+              <w:t>40.0</w:t>
+            </w:r>
+          </w:p>
           <w:p>
             <w:pPr>
               <w:tabs>
@@ -5861,6 +6021,11 @@
               <w:jc w:val="both"/>
             </w:pPr>
           </w:p>
+        </w:tc>
+        <w:tc>
+          <w:tcPr>
+            <w:tcW w:w="773" w:type="dxa"/>
+          </w:tcPr>
           <w:p>
             <w:pPr>
               <w:tabs>
@@ -5868,11 +6033,14 @@
               </w:tabs>
               <w:jc w:val="both"/>
             </w:pPr>
-          </w:p>
-        </w:tc>
-        <w:tc>
-          <w:tcPr>
-            <w:tcW w:w="898" w:type="dxa"/>
+            <w:r>
+              <w:t>5.5</w:t>
+            </w:r>
+          </w:p>
+        </w:tc>
+        <w:tc>
+          <w:tcPr>
+            <w:tcW w:w="923" w:type="dxa"/>
           </w:tcPr>
           <w:p>
             <w:pPr>
@@ -5881,11 +6049,14 @@
               </w:tabs>
               <w:jc w:val="both"/>
             </w:pPr>
-          </w:p>
-        </w:tc>
-        <w:tc>
-          <w:tcPr>
-            <w:tcW w:w="1050" w:type="dxa"/>
+            <w:r>
+              <w:t>366</w:t>
+            </w:r>
+          </w:p>
+        </w:tc>
+        <w:tc>
+          <w:tcPr>
+            <w:tcW w:w="865" w:type="dxa"/>
           </w:tcPr>
           <w:p>
             <w:pPr>
@@ -5894,11 +6065,14 @@
               </w:tabs>
               <w:jc w:val="both"/>
             </w:pPr>
-          </w:p>
-        </w:tc>
-        <w:tc>
-          <w:tcPr>
-            <w:tcW w:w="900" w:type="dxa"/>
+            <w:r>
+              <w:t>239</w:t>
+            </w:r>
+          </w:p>
+        </w:tc>
+        <w:tc>
+          <w:tcPr>
+            <w:tcW w:w="867" w:type="dxa"/>
           </w:tcPr>
           <w:p>
             <w:pPr>
@@ -5907,11 +6081,14 @@
               </w:tabs>
               <w:jc w:val="both"/>
             </w:pPr>
-          </w:p>
-        </w:tc>
-        <w:tc>
-          <w:tcPr>
-            <w:tcW w:w="925" w:type="dxa"/>
+            <w:r>
+              <w:t>0.83</w:t>
+            </w:r>
+          </w:p>
+        </w:tc>
+        <w:tc>
+          <w:tcPr>
+            <w:tcW w:w="1070" w:type="dxa"/>
           </w:tcPr>
           <w:p>
             <w:pPr>
@@ -5920,11 +6097,14 @@
               </w:tabs>
               <w:jc w:val="both"/>
             </w:pPr>
-          </w:p>
-        </w:tc>
-        <w:tc>
-          <w:tcPr>
-            <w:tcW w:w="962" w:type="dxa"/>
+            <w:r>
+              <w:t>1.1</w:t>
+            </w:r>
+          </w:p>
+        </w:tc>
+        <w:tc>
+          <w:tcPr>
+            <w:tcW w:w="1083" w:type="dxa"/>
           </w:tcPr>
           <w:p>
             <w:pPr>
@@ -5933,11 +6113,14 @@
               </w:tabs>
               <w:jc w:val="both"/>
             </w:pPr>
-          </w:p>
-        </w:tc>
-        <w:tc>
-          <w:tcPr>
-            <w:tcW w:w="1150" w:type="dxa"/>
+            <w:r>
+              <w:t>135</w:t>
+            </w:r>
+          </w:p>
+        </w:tc>
+        <w:tc>
+          <w:tcPr>
+            <w:tcW w:w="1056" w:type="dxa"/>
           </w:tcPr>
           <w:p>
             <w:pPr>
@@ -5946,11 +6129,14 @@
               </w:tabs>
               <w:jc w:val="both"/>
             </w:pPr>
-          </w:p>
-        </w:tc>
-        <w:tc>
-          <w:tcPr>
-            <w:tcW w:w="1043" w:type="dxa"/>
+            <w:r>
+              <w:t>14.1</w:t>
+            </w:r>
+          </w:p>
+        </w:tc>
+        <w:tc>
+          <w:tcPr>
+            <w:tcW w:w="913" w:type="dxa"/>
           </w:tcPr>
           <w:p>
             <w:pPr>
@@ -5959,11 +6145,14 @@
               </w:tabs>
               <w:jc w:val="both"/>
             </w:pPr>
-          </w:p>
-        </w:tc>
-        <w:tc>
-          <w:tcPr>
-            <w:tcW w:w="1056" w:type="dxa"/>
+            <w:r>
+              <w:t>15.51</w:t>
+            </w:r>
+          </w:p>
+        </w:tc>
+        <w:tc>
+          <w:tcPr>
+            <w:tcW w:w="1216" w:type="dxa"/>
           </w:tcPr>
           <w:p>
             <w:pPr>
@@ -5972,159 +6161,9 @@
               </w:tabs>
               <w:jc w:val="both"/>
             </w:pPr>
-          </w:p>
-        </w:tc>
-        <w:tc>
-          <w:tcPr>
-            <w:tcW w:w="1216" w:type="dxa"/>
-          </w:tcPr>
-          <w:p>
-            <w:pPr>
-              <w:tabs>
-                <w:tab w:val="left" w:pos="3600"/>
-              </w:tabs>
-              <w:jc w:val="both"/>
-            </w:pPr>
-          </w:p>
-        </w:tc>
-      </w:tr>
-      <w:tr>
-        <w:tc>
-          <w:tcPr>
-            <w:tcW w:w="984" w:type="dxa"/>
-          </w:tcPr>
-          <w:p>
-            <w:pPr>
-              <w:tabs>
-                <w:tab w:val="left" w:pos="3600"/>
-              </w:tabs>
-              <w:jc w:val="both"/>
-            </w:pPr>
-          </w:p>
-          <w:p>
-            <w:pPr>
-              <w:tabs>
-                <w:tab w:val="left" w:pos="3600"/>
-              </w:tabs>
-              <w:jc w:val="both"/>
-            </w:pPr>
-          </w:p>
-        </w:tc>
-        <w:tc>
-          <w:tcPr>
-            <w:tcW w:w="898" w:type="dxa"/>
-          </w:tcPr>
-          <w:p>
-            <w:pPr>
-              <w:tabs>
-                <w:tab w:val="left" w:pos="3600"/>
-              </w:tabs>
-              <w:jc w:val="both"/>
-            </w:pPr>
-          </w:p>
-        </w:tc>
-        <w:tc>
-          <w:tcPr>
-            <w:tcW w:w="1050" w:type="dxa"/>
-          </w:tcPr>
-          <w:p>
-            <w:pPr>
-              <w:tabs>
-                <w:tab w:val="left" w:pos="3600"/>
-              </w:tabs>
-              <w:jc w:val="both"/>
-            </w:pPr>
-          </w:p>
-        </w:tc>
-        <w:tc>
-          <w:tcPr>
-            <w:tcW w:w="900" w:type="dxa"/>
-          </w:tcPr>
-          <w:p>
-            <w:pPr>
-              <w:tabs>
-                <w:tab w:val="left" w:pos="3600"/>
-              </w:tabs>
-              <w:jc w:val="both"/>
-            </w:pPr>
-          </w:p>
-        </w:tc>
-        <w:tc>
-          <w:tcPr>
-            <w:tcW w:w="925" w:type="dxa"/>
-          </w:tcPr>
-          <w:p>
-            <w:pPr>
-              <w:tabs>
-                <w:tab w:val="left" w:pos="3600"/>
-              </w:tabs>
-              <w:jc w:val="both"/>
-            </w:pPr>
-          </w:p>
-        </w:tc>
-        <w:tc>
-          <w:tcPr>
-            <w:tcW w:w="962" w:type="dxa"/>
-          </w:tcPr>
-          <w:p>
-            <w:pPr>
-              <w:tabs>
-                <w:tab w:val="left" w:pos="3600"/>
-              </w:tabs>
-              <w:jc w:val="both"/>
-            </w:pPr>
-          </w:p>
-        </w:tc>
-        <w:tc>
-          <w:tcPr>
-            <w:tcW w:w="1150" w:type="dxa"/>
-          </w:tcPr>
-          <w:p>
-            <w:pPr>
-              <w:tabs>
-                <w:tab w:val="left" w:pos="3600"/>
-              </w:tabs>
-              <w:jc w:val="both"/>
-            </w:pPr>
-          </w:p>
-        </w:tc>
-        <w:tc>
-          <w:tcPr>
-            <w:tcW w:w="1043" w:type="dxa"/>
-          </w:tcPr>
-          <w:p>
-            <w:pPr>
-              <w:tabs>
-                <w:tab w:val="left" w:pos="3600"/>
-              </w:tabs>
-              <w:jc w:val="both"/>
-            </w:pPr>
-          </w:p>
-        </w:tc>
-        <w:tc>
-          <w:tcPr>
-            <w:tcW w:w="1056" w:type="dxa"/>
-          </w:tcPr>
-          <w:p>
-            <w:pPr>
-              <w:tabs>
-                <w:tab w:val="left" w:pos="3600"/>
-              </w:tabs>
-              <w:jc w:val="both"/>
-            </w:pPr>
-          </w:p>
-        </w:tc>
-        <w:tc>
-          <w:tcPr>
-            <w:tcW w:w="1216" w:type="dxa"/>
-          </w:tcPr>
-          <w:p>
-            <w:pPr>
-              <w:tabs>
-                <w:tab w:val="left" w:pos="3600"/>
-              </w:tabs>
-              <w:jc w:val="both"/>
-            </w:pPr>
+            <w:r>
+              <w:t>4.3</w:t>
+            </w:r>
           </w:p>
         </w:tc>
       </w:tr>
@@ -6196,7 +6235,299 @@
         <w:tabs>
           <w:tab w:val="left" w:pos="3600"/>
         </w:tabs>
-      </w:pPr>
+        <w:rPr>
+          <w:b/>
+          <w:bCs/>
+        </w:rPr>
+      </w:pPr>
+      <w:r>
+        <w:rPr>
+          <w:b/>
+          <w:bCs/>
+        </w:rPr>
+        <w:t xml:space="preserve">For this section, the point investigated was the third data set, meaning when the measured motor speed reached 1278 rpm. The </w:t>
+      </w:r>
+      <w:r>
+        <w:rPr>
+          <w:b/>
+          <w:bCs/>
+        </w:rPr>
+        <w:t>values estimated from the graphs in the appendix are the following:</w:t>
+      </w:r>
+    </w:p>
+    <w:p>
+      <w:pPr>
+        <w:tabs>
+          <w:tab w:val="left" w:pos="3600"/>
+        </w:tabs>
+        <w:rPr>
+          <w:b/>
+          <w:bCs/>
+        </w:rPr>
+      </w:pPr>
+    </w:p>
+    <w:p>
+      <w:pPr>
+        <w:pStyle w:val="ListParagraph"/>
+        <w:numPr>
+          <w:ilvl w:val="0"/>
+          <w:numId w:val="8"/>
+        </w:numPr>
+        <w:tabs>
+          <w:tab w:val="left" w:pos="3600"/>
+        </w:tabs>
+        <w:rPr>
+          <w:b/>
+          <w:bCs/>
+        </w:rPr>
+      </w:pPr>
+      <w:r>
+        <w:rPr>
+          <w:b/>
+          <w:bCs/>
+        </w:rPr>
+        <w:t>Output power = 140 W</w:t>
+      </w:r>
+    </w:p>
+    <w:p>
+      <w:pPr>
+        <w:pStyle w:val="ListParagraph"/>
+        <w:numPr>
+          <w:ilvl w:val="0"/>
+          <w:numId w:val="8"/>
+        </w:numPr>
+        <w:tabs>
+          <w:tab w:val="left" w:pos="3600"/>
+        </w:tabs>
+        <w:rPr>
+          <w:b/>
+          <w:bCs/>
+        </w:rPr>
+      </w:pPr>
+      <w:r>
+        <w:rPr>
+          <w:b/>
+          <w:bCs/>
+        </w:rPr>
+        <w:t>Torque = 1.05 Nm</w:t>
+      </w:r>
+    </w:p>
+    <w:p>
+      <w:pPr>
+        <w:pStyle w:val="ListParagraph"/>
+        <w:numPr>
+          <w:ilvl w:val="0"/>
+          <w:numId w:val="8"/>
+        </w:numPr>
+        <w:tabs>
+          <w:tab w:val="left" w:pos="3600"/>
+        </w:tabs>
+        <w:rPr>
+          <w:b/>
+          <w:bCs/>
+        </w:rPr>
+      </w:pPr>
+      <w:r>
+        <w:rPr>
+          <w:b/>
+          <w:bCs/>
+        </w:rPr>
+        <w:t>Input power = 300 W</w:t>
+      </w:r>
+    </w:p>
+    <w:p>
+      <w:pPr>
+        <w:pStyle w:val="ListParagraph"/>
+        <w:numPr>
+          <w:ilvl w:val="0"/>
+          <w:numId w:val="8"/>
+        </w:numPr>
+        <w:tabs>
+          <w:tab w:val="left" w:pos="3600"/>
+        </w:tabs>
+        <w:rPr>
+          <w:b/>
+          <w:bCs/>
+        </w:rPr>
+      </w:pPr>
+      <w:r>
+        <w:rPr>
+          <w:b/>
+          <w:bCs/>
+        </w:rPr>
+        <w:t>Current = 3.0 A</w:t>
+      </w:r>
+    </w:p>
+    <w:p>
+      <w:pPr>
+        <w:pStyle w:val="ListParagraph"/>
+        <w:numPr>
+          <w:ilvl w:val="0"/>
+          <w:numId w:val="8"/>
+        </w:numPr>
+        <w:tabs>
+          <w:tab w:val="left" w:pos="3600"/>
+        </w:tabs>
+        <w:rPr>
+          <w:b/>
+          <w:bCs/>
+        </w:rPr>
+      </w:pPr>
+      <w:r>
+        <w:rPr>
+          <w:b/>
+          <w:bCs/>
+        </w:rPr>
+        <w:t>Efficiency = 55 %</w:t>
+      </w:r>
+    </w:p>
+    <w:p>
+      <w:pPr>
+        <w:tabs>
+          <w:tab w:val="left" w:pos="3600"/>
+        </w:tabs>
+        <w:rPr>
+          <w:b/>
+          <w:bCs/>
+        </w:rPr>
+      </w:pPr>
+    </w:p>
+    <w:p>
+      <w:pPr>
+        <w:rPr>
+          <w:b/>
+          <w:bCs/>
+        </w:rPr>
+      </w:pPr>
+      <w:r>
+        <w:rPr>
+          <w:b/>
+          <w:bCs/>
+        </w:rPr>
+        <w:t>(Annotated graphs on the following page and the conclusion on the one after)</w:t>
+      </w:r>
+    </w:p>
+    <w:p>
+      <w:pPr>
+        <w:tabs>
+          <w:tab w:val="left" w:pos="3600"/>
+        </w:tabs>
+        <w:rPr>
+          <w:b/>
+          <w:bCs/>
+        </w:rPr>
+      </w:pPr>
+      <w:r>
+        <w:rPr>
+          <w:b/>
+          <w:bCs/>
+          <w:noProof/>
+        </w:rPr>
+        <w:lastRenderedPageBreak/>
+        <w:drawing>
+          <wp:inline distT="0" distB="0" distL="0" distR="0" wp14:anchorId="4FA80105" wp14:editId="79E84B07">
+            <wp:extent cx="6039485" cy="9252585"/>
+            <wp:effectExtent l="0" t="0" r="5715" b="5715"/>
+            <wp:docPr id="1066529895" name="Picture 2" descr="A group of graphs on paper&#10;&#10;AI-generated content may be incorrect."/>
+            <wp:cNvGraphicFramePr>
+              <a:graphicFrameLocks xmlns:a="http://schemas.openxmlformats.org/drawingml/2006/main" noChangeAspect="1"/>
+            </wp:cNvGraphicFramePr>
+            <a:graphic xmlns:a="http://schemas.openxmlformats.org/drawingml/2006/main">
+              <a:graphicData uri="http://schemas.openxmlformats.org/drawingml/2006/picture">
+                <pic:pic xmlns:pic="http://schemas.openxmlformats.org/drawingml/2006/picture">
+                  <pic:nvPicPr>
+                    <pic:cNvPr id="1066529895" name="Picture 2" descr="A group of graphs on paper&#10;&#10;AI-generated content may be incorrect."/>
+                    <pic:cNvPicPr/>
+                  </pic:nvPicPr>
+                  <pic:blipFill>
+                    <a:blip r:embed="rId24">
+                      <a:extLst>
+                        <a:ext uri="{28A0092B-C50C-407E-A947-70E740481C1C}">
+                          <a14:useLocalDpi xmlns:a14="http://schemas.microsoft.com/office/drawing/2010/main" val="0"/>
+                        </a:ext>
+                      </a:extLst>
+                    </a:blip>
+                    <a:stretch>
+                      <a:fillRect/>
+                    </a:stretch>
+                  </pic:blipFill>
+                  <pic:spPr>
+                    <a:xfrm>
+                      <a:off x="0" y="0"/>
+                      <a:ext cx="6039485" cy="9252585"/>
+                    </a:xfrm>
+                    <a:prstGeom prst="rect">
+                      <a:avLst/>
+                    </a:prstGeom>
+                  </pic:spPr>
+                </pic:pic>
+              </a:graphicData>
+            </a:graphic>
+          </wp:inline>
+        </w:drawing>
+      </w:r>
+    </w:p>
+    <w:p>
+      <w:pPr>
+        <w:tabs>
+          <w:tab w:val="left" w:pos="3600"/>
+        </w:tabs>
+        <w:jc w:val="both"/>
+        <w:rPr>
+          <w:b/>
+          <w:bCs/>
+        </w:rPr>
+      </w:pPr>
+      <w:r>
+        <w:rPr>
+          <w:b/>
+          <w:bCs/>
+        </w:rPr>
+        <w:lastRenderedPageBreak/>
+        <w:t>In conclusion</w:t>
+      </w:r>
+      <w:r>
+        <w:rPr>
+          <w:b/>
+          <w:bCs/>
+        </w:rPr>
+        <w:t xml:space="preserve">, the data estimated from the plots </w:t>
+      </w:r>
+      <w:r>
+        <w:rPr>
+          <w:b/>
+          <w:bCs/>
+        </w:rPr>
+        <w:t xml:space="preserve">aligns </w:t>
+      </w:r>
+      <w:r>
+        <w:rPr>
+          <w:b/>
+          <w:bCs/>
+        </w:rPr>
+        <w:t xml:space="preserve">with the experimental </w:t>
+      </w:r>
+      <w:r>
+        <w:rPr>
+          <w:b/>
+          <w:bCs/>
+        </w:rPr>
+        <w:t>values</w:t>
+      </w:r>
+      <w:r>
+        <w:rPr>
+          <w:b/>
+          <w:bCs/>
+        </w:rPr>
+        <w:t xml:space="preserve">, with expected deviations due to experimental and plotted errors. Firstly, the output power and torque estimated from the plots agree with the experimental data very well, being 140 W estimated vs. 133.8 W experimental and 1.05 estimated and 1.0 experimental, respectively. Furthermore, the current also lines up well with the experimental data, where the prediction was 3.0 A and the experimental data showed a current of 3.35 A. Moreover, a slight deviation was observed in the efficiency and readings, where the efficiency disagreed by about 10%, 55% estimated efficiency and 65.3% experimental. Lastly, the biggest deviation occurred in the input power data, where the prediction and experimental data disagreed by 100 W, 300W predicted vs 205 W experimental. This discrepancy is expected however, as the plots used for the estimation features the lowest resolution </w:t>
+      </w:r>
+      <w:r>
+        <w:rPr>
+          <w:b/>
+          <w:bCs/>
+        </w:rPr>
+        <w:t>and largest grid spacings of all the data points, meaning the estimated speed to input power relation has the lowest accuracy. Furthermore, the measurement instruments and circuit components themselves have an accuracy, which may introduce inconsistencies to the experimental data. Overall, the experimental data and predictions did line up well, with slight acceptable discrepancies caused by measurement and plotted inaccuracies.</w:t>
+      </w:r>
     </w:p>
     <w:p>
       <w:pPr>
@@ -6300,10 +6631,10 @@
           <w:position w:val="-28"/>
         </w:rPr>
         <w:object w:dxaOrig="1640" w:dyaOrig="740" w14:anchorId="3E0FE64E">
-          <v:shape id="_x0000_i1027" type="#_x0000_t75" alt="" style="width:116.2pt;height:52.35pt;mso-width-percent:0;mso-height-percent:0;mso-width-percent:0;mso-height-percent:0" o:ole="">
-            <v:imagedata r:id="rId23" o:title=""/>
+          <v:shape id="_x0000_i1027" type="#_x0000_t75" alt="" style="width:116.35pt;height:52.35pt;mso-width-percent:0;mso-height-percent:0;mso-width-percent:0;mso-height-percent:0" o:ole="">
+            <v:imagedata r:id="rId25" o:title=""/>
           </v:shape>
-          <o:OLEObject Type="Embed" ProgID="Equation.DSMT4" ShapeID="_x0000_i1027" DrawAspect="Content" ObjectID="_1833970093" r:id="rId24"/>
+          <o:OLEObject Type="Embed" ProgID="Equation.DSMT4" ShapeID="_x0000_i1027" DrawAspect="Content" ObjectID="_1835098902" r:id="rId26"/>
         </w:object>
       </w:r>
     </w:p>
@@ -6559,10 +6890,10 @@
           <w:position w:val="-28"/>
         </w:rPr>
         <w:object w:dxaOrig="1480" w:dyaOrig="680" w14:anchorId="26C67EE9">
-          <v:shape id="_x0000_i1026" type="#_x0000_t75" alt="" style="width:105.15pt;height:49.1pt;mso-width-percent:0;mso-height-percent:0;mso-width-percent:0;mso-height-percent:0" o:ole="">
-            <v:imagedata r:id="rId25" o:title=""/>
+          <v:shape id="_x0000_i1026" type="#_x0000_t75" alt="" style="width:105.45pt;height:49.45pt;mso-width-percent:0;mso-height-percent:0;mso-width-percent:0;mso-height-percent:0" o:ole="">
+            <v:imagedata r:id="rId27" o:title=""/>
           </v:shape>
-          <o:OLEObject Type="Embed" ProgID="Equation.DSMT4" ShapeID="_x0000_i1026" DrawAspect="Content" ObjectID="_1833970094" r:id="rId26"/>
+          <o:OLEObject Type="Embed" ProgID="Equation.DSMT4" ShapeID="_x0000_i1026" DrawAspect="Content" ObjectID="_1835098903" r:id="rId28"/>
         </w:object>
       </w:r>
     </w:p>
@@ -6593,10 +6924,10 @@
           <w:position w:val="-4"/>
         </w:rPr>
         <w:object w:dxaOrig="180" w:dyaOrig="279" w14:anchorId="11737F98">
-          <v:shape id="_x0000_i1025" type="#_x0000_t75" alt="" style="width:9.4pt;height:14.3pt;mso-width-percent:0;mso-height-percent:0;mso-width-percent:0;mso-height-percent:0" o:ole="">
-            <v:imagedata r:id="rId27" o:title=""/>
+          <v:shape id="_x0000_i1025" type="#_x0000_t75" alt="" style="width:9.45pt;height:14.55pt;mso-width-percent:0;mso-height-percent:0;mso-width-percent:0;mso-height-percent:0" o:ole="">
+            <v:imagedata r:id="rId29" o:title=""/>
           </v:shape>
-          <o:OLEObject Type="Embed" ProgID="Equation.DSMT4" ShapeID="_x0000_i1025" DrawAspect="Content" ObjectID="_1833970095" r:id="rId28"/>
+          <o:OLEObject Type="Embed" ProgID="Equation.DSMT4" ShapeID="_x0000_i1025" DrawAspect="Content" ObjectID="_1835098904" r:id="rId30"/>
         </w:object>
       </w:r>
       <w:r>
@@ -6823,7 +7154,7 @@
                     </pic:cNvPicPr>
                   </pic:nvPicPr>
                   <pic:blipFill>
-                    <a:blip r:embed="rId29" cstate="print">
+                    <a:blip r:embed="rId31" cstate="print">
                       <a:extLst>
                         <a:ext uri="{28A0092B-C50C-407E-A947-70E740481C1C}">
                           <a14:useLocalDpi xmlns:a14="http://schemas.microsoft.com/office/drawing/2010/main" val="0"/>
@@ -6928,8 +7259,8 @@
       </w:r>
     </w:p>
     <w:sectPr>
-      <w:footerReference w:type="even" r:id="rId30"/>
-      <w:footerReference w:type="default" r:id="rId31"/>
+      <w:footerReference w:type="even" r:id="rId32"/>
+      <w:footerReference w:type="default" r:id="rId33"/>
       <w:pgSz w:w="11907" w:h="16839" w:code="9"/>
       <w:pgMar w:top="1134" w:right="1138" w:bottom="1134" w:left="1134" w:header="720" w:footer="720" w:gutter="0"/>
       <w:cols w:space="720"/>
@@ -7300,6 +7631,119 @@
     </w:lvl>
   </w:abstractNum>
   <w:abstractNum w:abstractNumId="2" w15:restartNumberingAfterBreak="0">
+    <w:nsid w:val="19BD127A"/>
+    <w:multiLevelType w:val="hybridMultilevel"/>
+    <w:tmpl w:val="018E2738"/>
+    <w:lvl w:ilvl="0" w:tplc="08090001">
+      <w:start w:val="1"/>
+      <w:numFmt w:val="bullet"/>
+      <w:lvlText w:val=""/>
+      <w:lvlJc w:val="left"/>
+      <w:pPr>
+        <w:ind w:left="720" w:hanging="360"/>
+      </w:pPr>
+      <w:rPr>
+        <w:rFonts w:ascii="Symbol" w:hAnsi="Symbol" w:hint="default"/>
+      </w:rPr>
+    </w:lvl>
+    <w:lvl w:ilvl="1" w:tplc="08090003" w:tentative="1">
+      <w:start w:val="1"/>
+      <w:numFmt w:val="bullet"/>
+      <w:lvlText w:val="o"/>
+      <w:lvlJc w:val="left"/>
+      <w:pPr>
+        <w:ind w:left="1440" w:hanging="360"/>
+      </w:pPr>
+      <w:rPr>
+        <w:rFonts w:ascii="Courier New" w:hAnsi="Courier New" w:cs="Courier New" w:hint="default"/>
+      </w:rPr>
+    </w:lvl>
+    <w:lvl w:ilvl="2" w:tplc="08090005" w:tentative="1">
+      <w:start w:val="1"/>
+      <w:numFmt w:val="bullet"/>
+      <w:lvlText w:val=""/>
+      <w:lvlJc w:val="left"/>
+      <w:pPr>
+        <w:ind w:left="2160" w:hanging="360"/>
+      </w:pPr>
+      <w:rPr>
+        <w:rFonts w:ascii="Wingdings" w:hAnsi="Wingdings" w:hint="default"/>
+      </w:rPr>
+    </w:lvl>
+    <w:lvl w:ilvl="3" w:tplc="08090001" w:tentative="1">
+      <w:start w:val="1"/>
+      <w:numFmt w:val="bullet"/>
+      <w:lvlText w:val=""/>
+      <w:lvlJc w:val="left"/>
+      <w:pPr>
+        <w:ind w:left="2880" w:hanging="360"/>
+      </w:pPr>
+      <w:rPr>
+        <w:rFonts w:ascii="Symbol" w:hAnsi="Symbol" w:hint="default"/>
+      </w:rPr>
+    </w:lvl>
+    <w:lvl w:ilvl="4" w:tplc="08090003" w:tentative="1">
+      <w:start w:val="1"/>
+      <w:numFmt w:val="bullet"/>
+      <w:lvlText w:val="o"/>
+      <w:lvlJc w:val="left"/>
+      <w:pPr>
+        <w:ind w:left="3600" w:hanging="360"/>
+      </w:pPr>
+      <w:rPr>
+        <w:rFonts w:ascii="Courier New" w:hAnsi="Courier New" w:cs="Courier New" w:hint="default"/>
+      </w:rPr>
+    </w:lvl>
+    <w:lvl w:ilvl="5" w:tplc="08090005" w:tentative="1">
+      <w:start w:val="1"/>
+      <w:numFmt w:val="bullet"/>
+      <w:lvlText w:val=""/>
+      <w:lvlJc w:val="left"/>
+      <w:pPr>
+        <w:ind w:left="4320" w:hanging="360"/>
+      </w:pPr>
+      <w:rPr>
+        <w:rFonts w:ascii="Wingdings" w:hAnsi="Wingdings" w:hint="default"/>
+      </w:rPr>
+    </w:lvl>
+    <w:lvl w:ilvl="6" w:tplc="08090001" w:tentative="1">
+      <w:start w:val="1"/>
+      <w:numFmt w:val="bullet"/>
+      <w:lvlText w:val=""/>
+      <w:lvlJc w:val="left"/>
+      <w:pPr>
+        <w:ind w:left="5040" w:hanging="360"/>
+      </w:pPr>
+      <w:rPr>
+        <w:rFonts w:ascii="Symbol" w:hAnsi="Symbol" w:hint="default"/>
+      </w:rPr>
+    </w:lvl>
+    <w:lvl w:ilvl="7" w:tplc="08090003" w:tentative="1">
+      <w:start w:val="1"/>
+      <w:numFmt w:val="bullet"/>
+      <w:lvlText w:val="o"/>
+      <w:lvlJc w:val="left"/>
+      <w:pPr>
+        <w:ind w:left="5760" w:hanging="360"/>
+      </w:pPr>
+      <w:rPr>
+        <w:rFonts w:ascii="Courier New" w:hAnsi="Courier New" w:cs="Courier New" w:hint="default"/>
+      </w:rPr>
+    </w:lvl>
+    <w:lvl w:ilvl="8" w:tplc="08090005" w:tentative="1">
+      <w:start w:val="1"/>
+      <w:numFmt w:val="bullet"/>
+      <w:lvlText w:val=""/>
+      <w:lvlJc w:val="left"/>
+      <w:pPr>
+        <w:ind w:left="6480" w:hanging="360"/>
+      </w:pPr>
+      <w:rPr>
+        <w:rFonts w:ascii="Wingdings" w:hAnsi="Wingdings" w:hint="default"/>
+      </w:rPr>
+    </w:lvl>
+  </w:abstractNum>
+  <w:abstractNum w:abstractNumId="3" w15:restartNumberingAfterBreak="0">
     <w:nsid w:val="2BAF1576"/>
     <w:multiLevelType w:val="multilevel"/>
     <w:tmpl w:val="DDBC18EA"/>
@@ -7415,7 +7859,7 @@
       </w:pPr>
     </w:lvl>
   </w:abstractNum>
-  <w:abstractNum w:abstractNumId="3" w15:restartNumberingAfterBreak="0">
+  <w:abstractNum w:abstractNumId="4" w15:restartNumberingAfterBreak="0">
     <w:nsid w:val="3CE27968"/>
     <w:multiLevelType w:val="multilevel"/>
     <w:tmpl w:val="C8A61548"/>
@@ -7528,7 +7972,7 @@
       </w:pPr>
     </w:lvl>
   </w:abstractNum>
-  <w:abstractNum w:abstractNumId="4" w15:restartNumberingAfterBreak="0">
+  <w:abstractNum w:abstractNumId="5" w15:restartNumberingAfterBreak="0">
     <w:nsid w:val="63C013E3"/>
     <w:multiLevelType w:val="hybridMultilevel"/>
     <w:tmpl w:val="59FCAE4A"/>
@@ -7668,7 +8112,7 @@
       </w:rPr>
     </w:lvl>
   </w:abstractNum>
-  <w:abstractNum w:abstractNumId="5" w15:restartNumberingAfterBreak="0">
+  <w:abstractNum w:abstractNumId="6" w15:restartNumberingAfterBreak="0">
     <w:nsid w:val="7C3A0C49"/>
     <w:multiLevelType w:val="hybridMultilevel"/>
     <w:tmpl w:val="091CEFD4"/>
@@ -7808,7 +8252,7 @@
       </w:rPr>
     </w:lvl>
   </w:abstractNum>
-  <w:abstractNum w:abstractNumId="6" w15:restartNumberingAfterBreak="0">
+  <w:abstractNum w:abstractNumId="7" w15:restartNumberingAfterBreak="0">
     <w:nsid w:val="7C4110DF"/>
     <w:multiLevelType w:val="hybridMultilevel"/>
     <w:tmpl w:val="C8A61548"/>
@@ -7922,25 +8366,28 @@
     </w:lvl>
   </w:abstractNum>
   <w:num w:numId="1" w16cid:durableId="470942636">
-    <w:abstractNumId w:val="4"/>
+    <w:abstractNumId w:val="5"/>
   </w:num>
   <w:num w:numId="2" w16cid:durableId="357053032">
-    <w:abstractNumId w:val="5"/>
+    <w:abstractNumId w:val="6"/>
   </w:num>
   <w:num w:numId="3" w16cid:durableId="306011468">
     <w:abstractNumId w:val="1"/>
   </w:num>
   <w:num w:numId="4" w16cid:durableId="1456220789">
-    <w:abstractNumId w:val="2"/>
+    <w:abstractNumId w:val="3"/>
   </w:num>
   <w:num w:numId="5" w16cid:durableId="1878665247">
     <w:abstractNumId w:val="0"/>
   </w:num>
   <w:num w:numId="6" w16cid:durableId="1894461503">
-    <w:abstractNumId w:val="6"/>
+    <w:abstractNumId w:val="7"/>
   </w:num>
   <w:num w:numId="7" w16cid:durableId="401634905">
-    <w:abstractNumId w:val="3"/>
+    <w:abstractNumId w:val="4"/>
+  </w:num>
+  <w:num w:numId="8" w16cid:durableId="1726299190">
+    <w:abstractNumId w:val="2"/>
   </w:num>
 </w:numbering>
 </file>
@@ -7972,6 +8419,7 @@
     <w:lsdException w:name="Subtitle" w:qFormat="1"/>
     <w:lsdException w:name="Strong" w:qFormat="1"/>
     <w:lsdException w:name="Emphasis" w:qFormat="1"/>
+    <w:lsdException w:name="Normal (Web)" w:uiPriority="99"/>
     <w:lsdException w:name="Normal Table" w:semiHidden="1" w:unhideWhenUsed="1"/>
     <w:lsdException w:name="Table Simple 1" w:semiHidden="1" w:unhideWhenUsed="1"/>
     <w:lsdException w:name="Table Simple 2" w:semiHidden="1" w:unhideWhenUsed="1"/>
@@ -8338,6 +8786,31 @@
       <w:lang w:val="en-US" w:eastAsia="zh-CN"/>
     </w:rPr>
   </w:style>
+  <w:style w:type="paragraph" w:styleId="ListParagraph">
+    <w:name w:val="List Paragraph"/>
+    <w:basedOn w:val="Normal"/>
+    <w:uiPriority w:val="34"/>
+    <w:qFormat/>
+    <w:rsid w:val="004F24FA"/>
+    <w:pPr>
+      <w:ind w:left="720"/>
+      <w:contextualSpacing/>
+    </w:pPr>
+  </w:style>
+  <w:style w:type="paragraph" w:styleId="NormalWeb">
+    <w:name w:val="Normal (Web)"/>
+    <w:basedOn w:val="Normal"/>
+    <w:uiPriority w:val="99"/>
+    <w:unhideWhenUsed/>
+    <w:rsid w:val="00220702"/>
+    <w:pPr>
+      <w:spacing w:before="100" w:beforeAutospacing="1" w:after="100" w:afterAutospacing="1"/>
+    </w:pPr>
+    <w:rPr>
+      <w:rFonts w:eastAsia="Times New Roman"/>
+      <w:lang w:val="en-CZ" w:eastAsia="en-GB"/>
+    </w:rPr>
+  </w:style>
 </w:styles>
 </file>
 

</xml_diff>